<commit_message>
Update sales pitch doc: add Procurement & IT maturity section
The doc was written before the Procurement & IT maturity feature existed,
so it was missing the single best answer to the question colleagues ask
most ("is this account mature enough to pitch?"). Added a section and
folded it into the 30-second pitch and the tabs table.

Co-Authored-By: Claude Opus 5.5 <noreply@anthropic.com>
</commit_message>
<xml_diff>
--- a/sales_pitch.docx
+++ b/sales_pitch.docx
@@ -5,26 +5,20 @@
     <w:p>
       <w:pPr>
         <w:pStyle w:val="Heading1"/>
-        <w:spacing w:after="160" w:before="0"/>
-      </w:pPr>
-      <w:r>
-        <w:rPr>
-          <w:b/>
-          <w:bCs/>
-          <w:color w:val="13233F"/>
-        </w:rPr>
+      </w:pPr>
+      <w:r>
         <w:t xml:space="preserve">Account CoPilot — How It Works</w:t>
       </w:r>
     </w:p>
     <w:p>
       <w:pPr>
-        <w:spacing w:after="260"/>
+        <w:spacing w:after="240"/>
       </w:pPr>
       <w:r>
         <w:rPr>
           <w:i/>
           <w:iCs/>
-          <w:color w:val="475B7A"/>
+          <w:color w:val="555555"/>
           <w:sz w:val="20"/>
           <w:szCs w:val="20"/>
         </w:rPr>
@@ -34,14 +28,9 @@
     <w:p>
       <w:pPr>
         <w:pStyle w:val="Heading2"/>
-        <w:spacing w:after="120" w:before="300"/>
-      </w:pPr>
-      <w:r>
-        <w:rPr>
-          <w:b/>
-          <w:bCs/>
-          <w:color w:val="0B7A66"/>
-        </w:rPr>
+        <w:spacing w:after="120" w:before="280"/>
+      </w:pPr>
+      <w:r>
         <w:t xml:space="preserve">What it is</w:t>
       </w:r>
     </w:p>
@@ -60,14 +49,9 @@
     <w:p>
       <w:pPr>
         <w:pStyle w:val="Heading2"/>
-        <w:spacing w:after="120" w:before="300"/>
-      </w:pPr>
-      <w:r>
-        <w:rPr>
-          <w:b/>
-          <w:bCs/>
-          <w:color w:val="0B7A66"/>
-        </w:rPr>
+        <w:spacing w:after="120" w:before="280"/>
+      </w:pPr>
+      <w:r>
         <w:t xml:space="preserve">The 4-step engine</w:t>
       </w:r>
     </w:p>
@@ -99,14 +83,14 @@
           <w:sz w:val="22"/>
           <w:szCs w:val="22"/>
         </w:rPr>
-        <w:t xml:space="preserve">Find — </w:t>
-      </w:r>
-      <w:r>
-        <w:rPr>
-          <w:sz w:val="22"/>
-          <w:szCs w:val="22"/>
-        </w:rPr>
-        <w:t xml:space="preserve">searches the open web, stock-exchange filings, company sites, business press and job postings for companies that could fit the target profile.</w:t>
+        <w:t xml:space="preserve">Find</w:t>
+      </w:r>
+      <w:r>
+        <w:rPr>
+          <w:sz w:val="22"/>
+          <w:szCs w:val="22"/>
+        </w:rPr>
+        <w:t xml:space="preserve"> — searches the open web, stock-exchange filings, company sites, business press and job postings for companies that could fit the target profile.</w:t>
       </w:r>
     </w:p>
     <w:p>
@@ -125,14 +109,14 @@
           <w:sz w:val="22"/>
           <w:szCs w:val="22"/>
         </w:rPr>
-        <w:t xml:space="preserve">Check — </w:t>
-      </w:r>
-      <w:r>
-        <w:rPr>
-          <w:sz w:val="22"/>
-          <w:szCs w:val="22"/>
-        </w:rPr>
-        <w:t xml:space="preserve">reads official sources (annual reports, exchange filings, investor results) for the real numbers, before ever relying on an estimate.</w:t>
+        <w:t xml:space="preserve">Check</w:t>
+      </w:r>
+      <w:r>
+        <w:rPr>
+          <w:sz w:val="22"/>
+          <w:szCs w:val="22"/>
+        </w:rPr>
+        <w:t xml:space="preserve"> — reads official sources (annual reports, exchange filings, investor results) for the real numbers, before ever relying on an estimate.</w:t>
       </w:r>
     </w:p>
     <w:p>
@@ -151,14 +135,14 @@
           <w:sz w:val="22"/>
           <w:szCs w:val="22"/>
         </w:rPr>
-        <w:t xml:space="preserve">Verify — </w:t>
-      </w:r>
-      <w:r>
-        <w:rPr>
-          <w:sz w:val="22"/>
-          <w:szCs w:val="22"/>
-        </w:rPr>
-        <w:t xml:space="preserve">labels every fact by how solid it is: Fact (official source), Likely (credible estimate), Unverified, or Unknown — always with the source link.</w:t>
+        <w:t xml:space="preserve">Verify</w:t>
+      </w:r>
+      <w:r>
+        <w:rPr>
+          <w:sz w:val="22"/>
+          <w:szCs w:val="22"/>
+        </w:rPr>
+        <w:t xml:space="preserve"> — labels every fact by how solid it is: Fact (official source), Likely (credible estimate), Unverified, or Unknown — always with the source link.</w:t>
       </w:r>
     </w:p>
     <w:p>
@@ -177,27 +161,43 @@
           <w:sz w:val="22"/>
           <w:szCs w:val="22"/>
         </w:rPr>
-        <w:t xml:space="preserve">Re-check — </w:t>
-      </w:r>
-      <w:r>
-        <w:rPr>
-          <w:sz w:val="22"/>
-          <w:szCs w:val="22"/>
-        </w:rPr>
-        <w:t xml:space="preserve">anything short of Fact is revisited on a schedule, so a growing company's status improves automatically over time.</w:t>
+        <w:t xml:space="preserve">Re-check</w:t>
+      </w:r>
+      <w:r>
+        <w:rPr>
+          <w:sz w:val="22"/>
+          <w:szCs w:val="22"/>
+        </w:rPr>
+        <w:t xml:space="preserve"> — anything short of Fact is revisited on a schedule, so a growing company's status improves automatically over time.</w:t>
       </w:r>
     </w:p>
     <w:p>
       <w:pPr>
         <w:pStyle w:val="Heading2"/>
-        <w:spacing w:after="120" w:before="300"/>
-      </w:pPr>
-      <w:r>
-        <w:rPr>
-          <w:b/>
-          <w:bCs/>
-          <w:color w:val="0B7A66"/>
-        </w:rPr>
+        <w:spacing w:after="120" w:before="280"/>
+      </w:pPr>
+      <w:r>
+        <w:t xml:space="preserve">Procurement &amp; IT maturity — the other question people ask</w:t>
+      </w:r>
+    </w:p>
+    <w:p>
+      <w:pPr>
+        <w:spacing w:after="160"/>
+      </w:pPr>
+      <w:r>
+        <w:rPr>
+          <w:sz w:val="22"/>
+          <w:szCs w:val="22"/>
+        </w:rPr>
+        <w:t xml:space="preserve">Finding the right accounts is half the job; knowing how ready each one is for a Source-to-Pay implementation is the other half. Every account's brief now opens straight into a Procurement &amp; IT maturity rating — Advanced, Developing, Basic or Unknown — built from four things that actually predict readiness: whether they already run a competing S2P suite (Coupa, Ariba, GEP, Jaggaer, Ivalua, Zycus), their core ERP (SAP, Oracle, Microsoft...), the strength of any buying signal found, and their addressable spend. Each rating comes with a plain-English reason, not just a label. This is the question colleagues ask most — “is this account mature enough to pitch?” — and now the app answers it before anyone has to dig.</w:t>
+      </w:r>
+    </w:p>
+    <w:p>
+      <w:pPr>
+        <w:pStyle w:val="Heading2"/>
+        <w:spacing w:after="120" w:before="280"/>
+      </w:pPr>
+      <w:r>
         <w:t xml:space="preserve">ICP — what decides targeting</w:t>
       </w:r>
     </w:p>
@@ -216,14 +216,9 @@
     <w:p>
       <w:pPr>
         <w:pStyle w:val="Heading2"/>
-        <w:spacing w:after="120" w:before="300"/>
-      </w:pPr>
-      <w:r>
-        <w:rPr>
-          <w:b/>
-          <w:bCs/>
-          <w:color w:val="0B7A66"/>
-        </w:rPr>
+        <w:spacing w:after="120" w:before="280"/>
+      </w:pPr>
+      <w:r>
         <w:t xml:space="preserve">Free vs. paid</w:t>
       </w:r>
     </w:p>
@@ -243,14 +238,14 @@
           <w:sz w:val="22"/>
           <w:szCs w:val="22"/>
         </w:rPr>
-        <w:t xml:space="preserve">Free — </w:t>
-      </w:r>
-      <w:r>
-        <w:rPr>
-          <w:sz w:val="22"/>
-          <w:szCs w:val="22"/>
-        </w:rPr>
-        <w:t xml:space="preserve">the daily run, and anything queued for it to pick up, run on the Claude plan. No Anthropic API key is touched.</w:t>
+        <w:t xml:space="preserve">Free</w:t>
+      </w:r>
+      <w:r>
+        <w:rPr>
+          <w:sz w:val="22"/>
+          <w:szCs w:val="22"/>
+        </w:rPr>
+        <w:t xml:space="preserve"> — the daily run, and anything queued for it to pick up, run on the Claude plan. No Anthropic API key is touched.</w:t>
       </w:r>
     </w:p>
     <w:p>
@@ -269,27 +264,22 @@
           <w:sz w:val="22"/>
           <w:szCs w:val="22"/>
         </w:rPr>
-        <w:t xml:space="preserve">Paid — </w:t>
-      </w:r>
-      <w:r>
-        <w:rPr>
-          <w:sz w:val="22"/>
-          <w:szCs w:val="22"/>
-        </w:rPr>
-        <w:t xml:space="preserve">on-demand deep research (Research Queue, Research more, Draft pitch, paid Refresh) uses the Anthropic API key. Each shows its estimated cost before you confirm, and a PIN can be required before anything is spent.</w:t>
+        <w:t xml:space="preserve">Paid</w:t>
+      </w:r>
+      <w:r>
+        <w:rPr>
+          <w:sz w:val="22"/>
+          <w:szCs w:val="22"/>
+        </w:rPr>
+        <w:t xml:space="preserve"> — on-demand deep research (Research Queue, Research more, Draft pitch, paid Refresh) uses the Anthropic API key. Each shows its estimated cost before you confirm, and a PIN can be required before anything is spent.</w:t>
       </w:r>
     </w:p>
     <w:p>
       <w:pPr>
         <w:pStyle w:val="Heading2"/>
-        <w:spacing w:after="120" w:before="300"/>
-      </w:pPr>
-      <w:r>
-        <w:rPr>
-          <w:b/>
-          <w:bCs/>
-          <w:color w:val="0B7A66"/>
-        </w:rPr>
+        <w:spacing w:after="120" w:before="280"/>
+      </w:pPr>
+      <w:r>
         <w:t xml:space="preserve">The 5 tabs</w:t>
       </w:r>
     </w:p>
@@ -306,14 +296,14 @@
         </w:tblBorders>
       </w:tblPr>
       <w:tblGrid>
-        <w:gridCol w:w="2200"/>
-        <w:gridCol w:w="7160"/>
+        <w:gridCol w:w="2160"/>
+        <w:gridCol w:w="7200"/>
       </w:tblGrid>
       <w:tr>
         <w:tc>
           <w:tcPr>
-            <w:tcW w:type="dxa" w:w="2200"/>
-            <w:shd w:fill="E9EEF6" w:val="clear"/>
+            <w:tcW w:type="dxa" w:w="2160"/>
+            <w:shd w:fill="0F6E56" w:val="clear"/>
             <w:tcMar>
               <w:top w:type="dxa" w:w="100"/>
               <w:left w:type="dxa" w:w="120"/>
@@ -326,8 +316,9 @@
               <w:rPr>
                 <w:b/>
                 <w:bCs/>
-                <w:sz w:val="21"/>
-                <w:szCs w:val="21"/>
+                <w:color w:val="FFFFFF"/>
+                <w:sz w:val="20"/>
+                <w:szCs w:val="20"/>
               </w:rPr>
               <w:t xml:space="preserve">Tab</w:t>
             </w:r>
@@ -335,8 +326,8 @@
         </w:tc>
         <w:tc>
           <w:tcPr>
-            <w:tcW w:type="dxa" w:w="7160"/>
-            <w:shd w:fill="E9EEF6" w:val="clear"/>
+            <w:tcW w:type="dxa" w:w="7200"/>
+            <w:shd w:fill="0F6E56" w:val="clear"/>
             <w:tcMar>
               <w:top w:type="dxa" w:w="100"/>
               <w:left w:type="dxa" w:w="120"/>
@@ -349,8 +340,9 @@
               <w:rPr>
                 <w:b/>
                 <w:bCs/>
-                <w:sz w:val="21"/>
-                <w:szCs w:val="21"/>
+                <w:color w:val="FFFFFF"/>
+                <w:sz w:val="20"/>
+                <w:szCs w:val="20"/>
               </w:rPr>
               <w:t xml:space="preserve">What it does</w:t>
             </w:r>
@@ -360,7 +352,7 @@
       <w:tr>
         <w:tc>
           <w:tcPr>
-            <w:tcW w:type="dxa" w:w="2200"/>
+            <w:tcW w:type="dxa" w:w="2160"/>
             <w:tcMar>
               <w:top w:type="dxa" w:w="100"/>
               <w:left w:type="dxa" w:w="120"/>
@@ -373,8 +365,8 @@
               <w:rPr>
                 <w:b w:val="false"/>
                 <w:bCs w:val="false"/>
-                <w:sz w:val="21"/>
-                <w:szCs w:val="21"/>
+                <w:sz w:val="20"/>
+                <w:szCs w:val="20"/>
               </w:rPr>
               <w:t xml:space="preserve">Home</w:t>
             </w:r>
@@ -382,7 +374,7 @@
         </w:tc>
         <w:tc>
           <w:tcPr>
-            <w:tcW w:type="dxa" w:w="7160"/>
+            <w:tcW w:type="dxa" w:w="7200"/>
             <w:tcMar>
               <w:top w:type="dxa" w:w="100"/>
               <w:left w:type="dxa" w:w="120"/>
@@ -395,8 +387,8 @@
               <w:rPr>
                 <w:b w:val="false"/>
                 <w:bCs w:val="false"/>
-                <w:sz w:val="21"/>
-                <w:szCs w:val="21"/>
+                <w:sz w:val="20"/>
+                <w:szCs w:val="20"/>
               </w:rPr>
               <w:t xml:space="preserve">Orientation and the Setup Wizard — where to start someone new</w:t>
             </w:r>
@@ -406,7 +398,7 @@
       <w:tr>
         <w:tc>
           <w:tcPr>
-            <w:tcW w:type="dxa" w:w="2200"/>
+            <w:tcW w:type="dxa" w:w="2160"/>
             <w:tcMar>
               <w:top w:type="dxa" w:w="100"/>
               <w:left w:type="dxa" w:w="120"/>
@@ -419,8 +411,8 @@
               <w:rPr>
                 <w:b w:val="false"/>
                 <w:bCs w:val="false"/>
-                <w:sz w:val="21"/>
-                <w:szCs w:val="21"/>
+                <w:sz w:val="20"/>
+                <w:szCs w:val="20"/>
               </w:rPr>
               <w:t xml:space="preserve">Dashboard</w:t>
             </w:r>
@@ -428,7 +420,7 @@
         </w:tc>
         <w:tc>
           <w:tcPr>
-            <w:tcW w:type="dxa" w:w="7160"/>
+            <w:tcW w:type="dxa" w:w="7200"/>
             <w:tcMar>
               <w:top w:type="dxa" w:w="100"/>
               <w:left w:type="dxa" w:w="120"/>
@@ -441,8 +433,8 @@
               <w:rPr>
                 <w:b w:val="false"/>
                 <w:bCs w:val="false"/>
-                <w:sz w:val="21"/>
-                <w:szCs w:val="21"/>
+                <w:sz w:val="20"/>
+                <w:szCs w:val="20"/>
               </w:rPr>
               <w:t xml:space="preserve">The big picture; drill into any number</w:t>
             </w:r>
@@ -452,7 +444,7 @@
       <w:tr>
         <w:tc>
           <w:tcPr>
-            <w:tcW w:type="dxa" w:w="2200"/>
+            <w:tcW w:type="dxa" w:w="2160"/>
             <w:tcMar>
               <w:top w:type="dxa" w:w="100"/>
               <w:left w:type="dxa" w:w="120"/>
@@ -465,8 +457,8 @@
               <w:rPr>
                 <w:b w:val="false"/>
                 <w:bCs w:val="false"/>
-                <w:sz w:val="21"/>
-                <w:szCs w:val="21"/>
+                <w:sz w:val="20"/>
+                <w:szCs w:val="20"/>
               </w:rPr>
               <w:t xml:space="preserve">Accounts</w:t>
             </w:r>
@@ -474,7 +466,7 @@
         </w:tc>
         <w:tc>
           <w:tcPr>
-            <w:tcW w:type="dxa" w:w="7160"/>
+            <w:tcW w:type="dxa" w:w="7200"/>
             <w:tcMar>
               <w:top w:type="dxa" w:w="100"/>
               <w:left w:type="dxa" w:w="120"/>
@@ -487,10 +479,10 @@
               <w:rPr>
                 <w:b w:val="false"/>
                 <w:bCs w:val="false"/>
-                <w:sz w:val="21"/>
-                <w:szCs w:val="21"/>
+                <w:sz w:val="20"/>
+                <w:szCs w:val="20"/>
               </w:rPr>
-              <w:t xml:space="preserve">Every company, ranked, with ICP status</w:t>
+              <w:t xml:space="preserve">Every company, ranked, with ICP status and a Procurement &amp; IT maturity rating</w:t>
             </w:r>
           </w:p>
         </w:tc>
@@ -498,7 +490,7 @@
       <w:tr>
         <w:tc>
           <w:tcPr>
-            <w:tcW w:type="dxa" w:w="2200"/>
+            <w:tcW w:type="dxa" w:w="2160"/>
             <w:tcMar>
               <w:top w:type="dxa" w:w="100"/>
               <w:left w:type="dxa" w:w="120"/>
@@ -511,8 +503,8 @@
               <w:rPr>
                 <w:b w:val="false"/>
                 <w:bCs w:val="false"/>
-                <w:sz w:val="21"/>
-                <w:szCs w:val="21"/>
+                <w:sz w:val="20"/>
+                <w:szCs w:val="20"/>
               </w:rPr>
               <w:t xml:space="preserve">Stakeholders</w:t>
             </w:r>
@@ -520,7 +512,7 @@
         </w:tc>
         <w:tc>
           <w:tcPr>
-            <w:tcW w:type="dxa" w:w="7160"/>
+            <w:tcW w:type="dxa" w:w="7200"/>
             <w:tcMar>
               <w:top w:type="dxa" w:w="100"/>
               <w:left w:type="dxa" w:w="120"/>
@@ -533,8 +525,8 @@
               <w:rPr>
                 <w:b w:val="false"/>
                 <w:bCs w:val="false"/>
-                <w:sz w:val="21"/>
-                <w:szCs w:val="21"/>
+                <w:sz w:val="20"/>
+                <w:szCs w:val="20"/>
               </w:rPr>
               <w:t xml:space="preserve">The people — seniority and buyer-persona fit</w:t>
             </w:r>
@@ -544,7 +536,7 @@
       <w:tr>
         <w:tc>
           <w:tcPr>
-            <w:tcW w:type="dxa" w:w="2200"/>
+            <w:tcW w:type="dxa" w:w="2160"/>
             <w:tcMar>
               <w:top w:type="dxa" w:w="100"/>
               <w:left w:type="dxa" w:w="120"/>
@@ -557,8 +549,8 @@
               <w:rPr>
                 <w:b w:val="false"/>
                 <w:bCs w:val="false"/>
-                <w:sz w:val="21"/>
-                <w:szCs w:val="21"/>
+                <w:sz w:val="20"/>
+                <w:szCs w:val="20"/>
               </w:rPr>
               <w:t xml:space="preserve">Data / Setup</w:t>
             </w:r>
@@ -566,7 +558,7 @@
         </w:tc>
         <w:tc>
           <w:tcPr>
-            <w:tcW w:type="dxa" w:w="7160"/>
+            <w:tcW w:type="dxa" w:w="7200"/>
             <w:tcMar>
               <w:top w:type="dxa" w:w="100"/>
               <w:left w:type="dxa" w:w="120"/>
@@ -579,8 +571,8 @@
               <w:rPr>
                 <w:b w:val="false"/>
                 <w:bCs w:val="false"/>
-                <w:sz w:val="21"/>
-                <w:szCs w:val="21"/>
+                <w:sz w:val="20"/>
+                <w:szCs w:val="20"/>
               </w:rPr>
               <w:t xml:space="preserve">Where facts came from, conflicts, and all configuration (ICP rules, engine settings, team access)</w:t>
             </w:r>
@@ -588,51 +580,38 @@
         </w:tc>
       </w:tr>
     </w:tbl>
-    <w:p>
-      <w:pPr>
-        <w:spacing w:after="200"/>
-      </w:pPr>
-    </w:p>
+    <w:p/>
     <w:p>
       <w:pPr>
         <w:pStyle w:val="Heading2"/>
-        <w:spacing w:after="120" w:before="300"/>
+        <w:spacing w:after="120" w:before="280"/>
+      </w:pPr>
+      <w:r>
+        <w:t xml:space="preserve">The 30-second pitch</w:t>
+      </w:r>
+    </w:p>
+    <w:p>
+      <w:pPr>
+        <w:spacing w:after="160"/>
+      </w:pPr>
+      <w:r>
+        <w:rPr>
+          <w:i/>
+          <w:iCs/>
+          <w:sz w:val="22"/>
+          <w:szCs w:val="22"/>
+        </w:rPr>
+        <w:t xml:space="preserve">“It's an AI agent that runs itself every morning — finds companies that fit our target profile, checks their real financials against official sources, and never guesses. For every account it also tells you how procurement-and-IT-mature they are and why, so you know who's actually ready for an S2P conversation. Everything it tells you has a source and a confidence label attached. You set the targeting rules once per region, and it just keeps working.”</w:t>
+      </w:r>
+    </w:p>
+    <w:p>
+      <w:pPr>
+        <w:spacing w:after="160"/>
       </w:pPr>
       <w:r>
         <w:rPr>
           <w:b/>
           <w:bCs/>
-          <w:color w:val="0B7A66"/>
-        </w:rPr>
-        <w:t xml:space="preserve">The 30-second pitch</w:t>
-      </w:r>
-    </w:p>
-    <w:p>
-      <w:pPr>
-        <w:pBdr>
-          <w:left w:val="single" w:color="0B7A66" w:sz="18" w:space="8"/>
-        </w:pBdr>
-        <w:spacing w:after="200" w:before="60"/>
-        <w:ind w:left="360"/>
-      </w:pPr>
-      <w:r>
-        <w:rPr>
-          <w:i/>
-          <w:iCs/>
-          <w:sz w:val="22"/>
-          <w:szCs w:val="22"/>
-        </w:rPr>
-        <w:t xml:space="preserve">“It's an AI agent that runs itself every morning — finds companies that fit our target profile, checks their real financials against official sources, and never guesses. Everything it tells you has a source and a confidence label attached. You set the targeting rules once per region, and it just keeps working.”</w:t>
-      </w:r>
-    </w:p>
-    <w:p>
-      <w:pPr>
-        <w:spacing w:after="160"/>
-      </w:pPr>
-      <w:r>
-        <w:rPr>
-          <w:b/>
-          <w:bCs/>
           <w:sz w:val="22"/>
           <w:szCs w:val="22"/>
         </w:rPr>
@@ -648,7 +627,7 @@
     </w:p>
     <w:sectPr>
       <w:pgSz w:w="12240" w:h="15840" w:orient="portrait"/>
-      <w:pgMar w:top="1080" w:right="1440" w:bottom="1080" w:left="1440" w:header="708" w:footer="708" w:gutter="0"/>
+      <w:pgMar w:top="1440" w:right="1440" w:bottom="1440" w:left="1440" w:header="708" w:footer="708" w:gutter="0"/>
       <w:pgNumType/>
       <w:docGrid w:linePitch="360"/>
     </w:sectPr>
@@ -820,11 +799,11 @@
     <w:multiLevelType w:val="hybridMultilevel"/>
     <w:lvl w:ilvl="0" w:tentative="1">
       <w:start w:val="1"/>
-      <w:numFmt w:val="decimal"/>
-      <w:lvlText w:val="%1."/>
+      <w:numFmt w:val="bullet"/>
+      <w:lvlText w:val="•"/>
       <w:lvlJc w:val="left"/>
       <w:pPr>
-        <w:ind w:left="504" w:hanging="360"/>
+        <w:ind w:left="420" w:hanging="260"/>
       </w:pPr>
     </w:lvl>
   </w:abstractNum>
@@ -832,11 +811,11 @@
     <w:multiLevelType w:val="hybridMultilevel"/>
     <w:lvl w:ilvl="0" w:tentative="1">
       <w:start w:val="1"/>
-      <w:numFmt w:val="bullet"/>
-      <w:lvlText w:val="•"/>
+      <w:numFmt w:val="decimal"/>
+      <w:lvlText w:val="%1."/>
       <w:lvlJc w:val="left"/>
       <w:pPr>
-        <w:ind w:left="504" w:hanging="360"/>
+        <w:ind w:left="420" w:hanging="260"/>
       </w:pPr>
     </w:lvl>
   </w:abstractNum>
@@ -847,13 +826,13 @@
     </w:lvlOverride>
   </w:num>
   <w:num w:numId="2">
-    <w:abstractNumId w:val="2"/>
+    <w:abstractNumId w:val="3"/>
     <w:lvlOverride w:ilvl="0">
       <w:startOverride w:val="1"/>
     </w:lvlOverride>
   </w:num>
   <w:num w:numId="3">
-    <w:abstractNumId w:val="3"/>
+    <w:abstractNumId w:val="2"/>
     <w:lvlOverride w:ilvl="0">
       <w:startOverride w:val="1"/>
     </w:lvlOverride>

</xml_diff>

<commit_message>
Sales pitch: add field-count detail to Free vs Paid vs Verification
Matches the new Home page stat lines (v3.28) — 19 fields per company from
free daily search, 39 more company fields plus a 27-field contact profile
from paid research, and verification adding no new fields of its own.

Co-Authored-By: Claude Opus 5.5 <noreply@anthropic.com>
</commit_message>
<xml_diff>
--- a/sales_pitch.docx
+++ b/sales_pitch.docx
@@ -245,7 +245,23 @@
           <w:sz w:val="22"/>
           <w:szCs w:val="22"/>
         </w:rPr>
-        <w:t xml:space="preserve"> — the daily run, and anything queued for it to pick up, run on the Claude plan. No Anthropic API key is touched.</w:t>
+        <w:t xml:space="preserve"> — the daily run, and anything queued for it to pick up, run on the Claude plan. No Anthropic API key is touched. Enriches </w:t>
+      </w:r>
+      <w:r>
+        <w:rPr>
+          <w:b/>
+          <w:bCs/>
+          <w:sz w:val="22"/>
+          <w:szCs w:val="22"/>
+        </w:rPr>
+        <w:t xml:space="preserve">19 fields per company</w:t>
+      </w:r>
+      <w:r>
+        <w:rPr>
+          <w:sz w:val="22"/>
+          <w:szCs w:val="22"/>
+        </w:rPr>
+        <w:t xml:space="preserve">: 5 on discovery (name, website, country, industry, HQ city) and 14 on the revenue check (status, listing, exchange, ticker, revenue figure, year, type, source + link, confidence, ICP fit, fit reason, employees, checked date).</w:t>
       </w:r>
     </w:p>
     <w:p>
@@ -271,7 +287,65 @@
           <w:sz w:val="22"/>
           <w:szCs w:val="22"/>
         </w:rPr>
-        <w:t xml:space="preserve"> — on-demand deep research (Research Queue, Research more, Draft pitch, paid Refresh) uses the Anthropic API key. Each shows its estimated cost before you confirm, and a PIN can be required before anything is spent.</w:t>
+        <w:t xml:space="preserve"> — on-demand deep research (Research Queue, Research more, Draft pitch, paid Refresh) uses the Anthropic API key. Each shows its estimated cost before you confirm, and a PIN can be required before anything is spent. Adds </w:t>
+      </w:r>
+      <w:r>
+        <w:rPr>
+          <w:b/>
+          <w:bCs/>
+          <w:sz w:val="22"/>
+          <w:szCs w:val="22"/>
+        </w:rPr>
+        <w:t xml:space="preserve">39 more company fields</w:t>
+      </w:r>
+      <w:r>
+        <w:rPr>
+          <w:sz w:val="22"/>
+          <w:szCs w:val="22"/>
+        </w:rPr>
+        <w:t xml:space="preserve"> (ownership, ERP, S2P/Coupa/Ariba signal, buying triggers, opportunity type, board phone and more) plus a full </w:t>
+      </w:r>
+      <w:r>
+        <w:rPr>
+          <w:b/>
+          <w:bCs/>
+          <w:sz w:val="22"/>
+          <w:szCs w:val="22"/>
+        </w:rPr>
+        <w:t xml:space="preserve">27-field profile for every contact</w:t>
+      </w:r>
+      <w:r>
+        <w:rPr>
+          <w:sz w:val="22"/>
+          <w:szCs w:val="22"/>
+        </w:rPr>
+        <w:t xml:space="preserve"> found (title, email, phone, LinkedIn, seniority, department and more) — none of that exists until paid research runs.</w:t>
+      </w:r>
+    </w:p>
+    <w:p>
+      <w:pPr>
+        <w:pStyle w:val="ListParagraph"/>
+        <w:numPr>
+          <w:ilvl w:val="0"/>
+          <w:numId w:val="3"/>
+        </w:numPr>
+        <w:spacing w:after="100"/>
+      </w:pPr>
+      <w:r>
+        <w:rPr>
+          <w:b/>
+          <w:bCs/>
+          <w:sz w:val="22"/>
+          <w:szCs w:val="22"/>
+        </w:rPr>
+        <w:t xml:space="preserve">Verification</w:t>
+      </w:r>
+      <w:r>
+        <w:rPr>
+          <w:sz w:val="22"/>
+          <w:szCs w:val="22"/>
+        </w:rPr>
+        <w:t xml:space="preserve"> runs on every company, free or paid, and adds no new fields of its own — it labels every field already found with one of 4 confidence levels (Fact / Likely / Unverified / Unknown) and re-checks revenue roughly every 180 days, so nothing is ever just a guess.</w:t>
       </w:r>
     </w:p>
     <w:p>

</xml_diff>